<commit_message>
feat: implement Portfolio V2 redesign (sober, bilingual, backend-focused)
</commit_message>
<xml_diff>
--- a/Joaquin Gonzalez Zanotti CV.docx
+++ b/Joaquin Gonzalez Zanotti CV.docx
@@ -37,6 +37,7 @@
         </w:r>
       </w:hyperlink>
       <w:hyperlink r:id="rId9" w:history="1">
+        <w:proofErr w:type="spellStart"/>
         <w:r>
           <w:rPr>
             <w:rStyle w:val="Hipervnculo"/>
@@ -44,6 +45,7 @@
           </w:rPr>
           <w:t>Linkedin</w:t>
         </w:r>
+        <w:proofErr w:type="spellEnd"/>
       </w:hyperlink>
       <w:r>
         <w:rPr>
@@ -60,56 +62,15 @@
         </w:rPr>
         <w:t xml:space="preserve"> </w:t>
       </w:r>
-      <w:r>
-        <w:rPr>
-          <w:color w:val="0070C0"/>
-        </w:rPr>
-        <w:fldChar w:fldCharType="begin"/>
-      </w:r>
-      <w:r>
-        <w:rPr>
-          <w:color w:val="0070C0"/>
-        </w:rPr>
-        <w:instrText>HYPERLINK "https://joaquingz.com.ar/"</w:instrText>
-      </w:r>
-      <w:r>
-        <w:rPr>
-          <w:color w:val="0070C0"/>
-        </w:rPr>
-      </w:r>
-      <w:r>
-        <w:rPr>
-          <w:color w:val="0070C0"/>
-        </w:rPr>
-        <w:fldChar w:fldCharType="separate"/>
-      </w:r>
-      <w:r>
-        <w:rPr>
-          <w:rStyle w:val="Hipervnculo"/>
-          <w:color w:val="0070C0"/>
-        </w:rPr>
-        <w:t>Port</w:t>
-      </w:r>
-      <w:r>
-        <w:rPr>
-          <w:rStyle w:val="Hipervnculo"/>
-          <w:color w:val="0070C0"/>
-        </w:rPr>
-        <w:t>f</w:t>
-      </w:r>
-      <w:r>
-        <w:rPr>
-          <w:rStyle w:val="Hipervnculo"/>
-          <w:color w:val="0070C0"/>
-        </w:rPr>
-        <w:t>olio</w:t>
-      </w:r>
-      <w:r>
-        <w:rPr>
-          <w:color w:val="0070C0"/>
-        </w:rPr>
-        <w:fldChar w:fldCharType="end"/>
-      </w:r>
+      <w:hyperlink r:id="rId10" w:history="1">
+        <w:r>
+          <w:rPr>
+            <w:rStyle w:val="Hipervnculo"/>
+            <w:color w:val="0070C0"/>
+          </w:rPr>
+          <w:t>Portfolio</w:t>
+        </w:r>
+      </w:hyperlink>
     </w:p>
     <w:p>
       <w:pPr>
@@ -425,7 +386,7 @@
           <w:szCs w:val="28"/>
           <w:lang w:val="en-US"/>
         </w:rPr>
-        <w:t xml:space="preserve">React, Node.js, Express, Spring Boot, .NET, Bootstrap.  </w:t>
+        <w:t>React, Node.js, Express, Spring Boot, .NET, Bootstrap.</w:t>
       </w:r>
     </w:p>
     <w:p>
@@ -444,27 +405,43 @@
         <w:rPr>
           <w:sz w:val="24"/>
           <w:szCs w:val="28"/>
-          <w:lang w:val="en-US"/>
-        </w:rPr>
-        <w:t xml:space="preserve">ORM y backend: Entity Framework, </w:t>
-      </w:r>
-      <w:proofErr w:type="spellStart"/>
-      <w:r>
-        <w:rPr>
-          <w:sz w:val="24"/>
-          <w:szCs w:val="28"/>
-          <w:lang w:val="en-US"/>
-        </w:rPr>
-        <w:t>desarrollo</w:t>
-      </w:r>
-      <w:proofErr w:type="spellEnd"/>
-      <w:r>
-        <w:rPr>
-          <w:sz w:val="24"/>
-          <w:szCs w:val="28"/>
-          <w:lang w:val="en-US"/>
-        </w:rPr>
-        <w:t xml:space="preserve"> de APIs REST. </w:t>
+        </w:rPr>
+        <w:t xml:space="preserve">Bases de datos: </w:t>
+      </w:r>
+      <w:r>
+        <w:rPr>
+          <w:sz w:val="24"/>
+          <w:szCs w:val="28"/>
+        </w:rPr>
+        <w:t>Post</w:t>
+      </w:r>
+      <w:r>
+        <w:rPr>
+          <w:sz w:val="24"/>
+          <w:szCs w:val="28"/>
+        </w:rPr>
+        <w:t>g</w:t>
+      </w:r>
+      <w:r>
+        <w:rPr>
+          <w:sz w:val="24"/>
+          <w:szCs w:val="28"/>
+        </w:rPr>
+        <w:t xml:space="preserve">reSQL, </w:t>
+      </w:r>
+      <w:r>
+        <w:rPr>
+          <w:sz w:val="24"/>
+          <w:szCs w:val="28"/>
+        </w:rPr>
+        <w:t>MySQL, SQLite</w:t>
+      </w:r>
+      <w:r>
+        <w:rPr>
+          <w:sz w:val="24"/>
+          <w:szCs w:val="28"/>
+        </w:rPr>
+        <w:t>.</w:t>
       </w:r>
     </w:p>
     <w:p>
@@ -484,7 +461,7 @@
           <w:sz w:val="24"/>
           <w:szCs w:val="28"/>
         </w:rPr>
-        <w:t xml:space="preserve">Bases de datos: </w:t>
+        <w:t xml:space="preserve">Herramientas: Git, GitHub, </w:t>
       </w:r>
       <w:proofErr w:type="spellStart"/>
       <w:r>
@@ -492,7 +469,7 @@
           <w:sz w:val="24"/>
           <w:szCs w:val="28"/>
         </w:rPr>
-        <w:t>PostGreSQL</w:t>
+        <w:t>GitLab</w:t>
       </w:r>
       <w:proofErr w:type="spellEnd"/>
       <w:r>
@@ -500,21 +477,21 @@
           <w:sz w:val="24"/>
           <w:szCs w:val="28"/>
         </w:rPr>
-        <w:t xml:space="preserve">, </w:t>
-      </w:r>
-      <w:r>
-        <w:rPr>
-          <w:sz w:val="24"/>
-          <w:szCs w:val="28"/>
-        </w:rPr>
-        <w:t>MySQL, SQLite</w:t>
-      </w:r>
-      <w:r>
-        <w:rPr>
-          <w:sz w:val="24"/>
-          <w:szCs w:val="28"/>
-        </w:rPr>
-        <w:t>.</w:t>
+        <w:t xml:space="preserve">, JWT, Visual Studio Code, </w:t>
+      </w:r>
+      <w:r>
+        <w:rPr>
+          <w:sz w:val="24"/>
+          <w:szCs w:val="28"/>
+        </w:rPr>
+        <w:t>Jira</w:t>
+      </w:r>
+      <w:r>
+        <w:rPr>
+          <w:sz w:val="24"/>
+          <w:szCs w:val="28"/>
+        </w:rPr>
+        <w:t xml:space="preserve">. </w:t>
       </w:r>
     </w:p>
     <w:p>
@@ -534,37 +511,7 @@
           <w:sz w:val="24"/>
           <w:szCs w:val="28"/>
         </w:rPr>
-        <w:t xml:space="preserve">Herramientas: Git, GitHub, </w:t>
-      </w:r>
-      <w:proofErr w:type="spellStart"/>
-      <w:r>
-        <w:rPr>
-          <w:sz w:val="24"/>
-          <w:szCs w:val="28"/>
-        </w:rPr>
-        <w:t>GitLab</w:t>
-      </w:r>
-      <w:proofErr w:type="spellEnd"/>
-      <w:r>
-        <w:rPr>
-          <w:sz w:val="24"/>
-          <w:szCs w:val="28"/>
-        </w:rPr>
-        <w:t xml:space="preserve">, Maven, JWT, Visual Studio Code, </w:t>
-      </w:r>
-      <w:r>
-        <w:rPr>
-          <w:sz w:val="24"/>
-          <w:szCs w:val="28"/>
-        </w:rPr>
-        <w:t>Jira</w:t>
-      </w:r>
-      <w:r>
-        <w:rPr>
-          <w:sz w:val="24"/>
-          <w:szCs w:val="28"/>
-        </w:rPr>
-        <w:t xml:space="preserve">. </w:t>
+        <w:t xml:space="preserve">Modelado y diseño: UML, BPMN, arquitectura multicapa y microservicios. </w:t>
       </w:r>
     </w:p>
     <w:p>
@@ -574,17 +521,13 @@
           <w:ilvl w:val="0"/>
           <w:numId w:val="1"/>
         </w:numPr>
-        <w:rPr>
-          <w:sz w:val="24"/>
-          <w:szCs w:val="28"/>
-        </w:rPr>
-      </w:pPr>
-      <w:r>
-        <w:rPr>
-          <w:sz w:val="24"/>
-          <w:szCs w:val="28"/>
-        </w:rPr>
-        <w:t xml:space="preserve">Modelado y diseño: UML, BPMN, arquitectura multicapa y microservicios. </w:t>
+      </w:pPr>
+      <w:r>
+        <w:rPr>
+          <w:sz w:val="24"/>
+          <w:szCs w:val="28"/>
+        </w:rPr>
+        <w:t>Metodologías de trabajo: Scrum, Kanban</w:t>
       </w:r>
     </w:p>
     <w:p>
@@ -595,22 +538,6 @@
           <w:numId w:val="1"/>
         </w:numPr>
       </w:pPr>
-      <w:r>
-        <w:rPr>
-          <w:sz w:val="24"/>
-          <w:szCs w:val="28"/>
-        </w:rPr>
-        <w:t>Metodologías de trabajo: Scrum, Kanban</w:t>
-      </w:r>
-    </w:p>
-    <w:p>
-      <w:pPr>
-        <w:pStyle w:val="Prrafodelista"/>
-        <w:numPr>
-          <w:ilvl w:val="0"/>
-          <w:numId w:val="1"/>
-        </w:numPr>
-      </w:pPr>
       <w:proofErr w:type="spellStart"/>
       <w:r>
         <w:rPr>
@@ -648,22 +575,13 @@
         </w:rPr>
         <w:t xml:space="preserve"> TCP/IP, </w:t>
       </w:r>
-      <w:proofErr w:type="spellStart"/>
-      <w:r>
-        <w:rPr>
-          <w:sz w:val="24"/>
-          <w:szCs w:val="28"/>
-        </w:rPr>
-        <w:t>t</w:t>
-      </w:r>
-      <w:r>
-        <w:rPr>
-          <w:sz w:val="24"/>
-          <w:szCs w:val="28"/>
-        </w:rPr>
-        <w:t>ecnologias</w:t>
-      </w:r>
-      <w:proofErr w:type="spellEnd"/>
+      <w:r>
+        <w:rPr>
+          <w:sz w:val="24"/>
+          <w:szCs w:val="28"/>
+        </w:rPr>
+        <w:t>tecnologías</w:t>
+      </w:r>
       <w:r>
         <w:rPr>
           <w:sz w:val="24"/>

</xml_diff>